<commit_message>
Update paper with re-measured throughput and directBestEffort regression story
Reflect the honest post-submission timeline: replace throughput figures with
re-measured values (104.2/1,026.3/5,001.2 events/sec), rewrite 5.3 as a
two-stage directBestEffort regression narrative, note the load-test script's
own settle-phase SSE backlog bug, and expand 7.1's discussion of the
directBestEffort limitation. Also fix a stale sink label in the architecture
diagram (directBestEffort -> buffer 20000).
</commit_message>
<xml_diff>
--- a/docs/paper_draft.docx
+++ b/docs/paper_draft.docx
@@ -89,7 +89,7 @@
           <w:i w:val="0"/>
           <w:sz w:val="22"/>
         </w:rPr>
-        <w:t>IoT 기기나 서버처럼 다수의 디바이스가 동시에 데이터를 쏟아내는 환경에서는, 그 데이터를 실시간으로 처리하는 것 못지않게 디바이스 수가 늘어나도 시스템이 버텨주는지가 중요하다. 이 프로젝트에서는 Spring Boot WebFlux로 반응형 실시간 모니터링 시스템 Welfry를 만들고, Welford's Online Algorithm과 Z-score를 결합해 디바이스별 이상치를 스트리밍 방식으로 탐지하도록 구현했다. 여기서 그치지 않고 디바이스 수를 100 → 1,000 → 5,000대로 늘려가는 부하 테스트를 직접 짜서, 실제로 부하가 걸렸을 때 시스템이 어떻게 동작하는지를 실측했다. 그 과정에서 이벤트 드롭으로 인한 처리량 정체, 디바이스 스케일업 시 이상치 오탐, 유휴 구독자 재연결 시 대시보드 수치 폭주, 최신 JDK 환경에서의 테스트 프레임워크 호환성 문제까지 총 네 가지를 실제로 겪었고, 하나씩 원인을 추적해 고쳤다. 그 결과 처리량이 디바이스 수 증가에 따라 100.1 → 974.9 → 4,975.7 events/sec로 거의 선형적으로 늘어나는 것을 확인했으며, 핵심 로직과 신규 구현 계층을 포함해 21건의 테스트와 GitHub Actions CI로 검증 체계를 갖췄다.</w:t>
+        <w:t>IoT 기기나 서버처럼 다수의 디바이스가 동시에 데이터를 쏟아내는 환경에서는, 그 데이터를 실시간으로 처리하는 것 못지않게 디바이스 수가 늘어나도 시스템이 버텨주는지가 중요하다. 이 프로젝트에서는 Spring Boot WebFlux로 반응형 실시간 모니터링 시스템 Welfry를 만들고, Welford's Online Algorithm과 Z-score를 결합해 디바이스별 이상치를 스트리밍 방식으로 탐지하도록 구현했다. 여기서 그치지 않고 디바이스 수를 100 → 1,000 → 5,000대로 늘려가는 부하 테스트를 직접 짜서, 실제로 부하가 걸렸을 때 시스템이 어떻게 동작하는지를 실측했다. 그 과정에서 이벤트 드롭으로 인한 처리량 정체, 디바이스 스케일업 시 이상치 오탐, 유휴 구독자 재연결 시 대시보드 수치 폭주, 최신 JDK 환경에서의 테스트 프레임워크 호환성 문제까지 총 네 가지를 실제로 겪었고, 하나씩 원인을 추적해 고쳤다. 특히 대시보드 수치 폭주 문제는 한 번에 끝나지 않아서, 1차로 적용한 수정이 또 다른 문제(활성 구독자의 이벤트 유실)를 낳는 것을 재검증 과정에서 추가로 발견해 다시 고치는 2단계를 거쳤다. 그 결과 처리량이 디바이스 수 증가에 따라 104.2 → 1,026.3 → 5,001.2 events/sec로 거의 선형적으로 늘어나는 것을 확인했으며, 핵심 로직과 신규 구현 계층을 포함해 21건의 테스트와 GitHub Actions CI로 검증 체계를 갖췄다.</w:t>
       </w:r>
     </w:p>
     <w:p>
@@ -840,6 +840,20 @@
           <w:sz w:val="22"/>
         </w:rPr>
         <w:t>표준 라이브러리만으로, 별도 의존성 없이 만들었다. PUT /api/devices/scale로 디바이스 수를 단계적으로 늘리고, 안정화 시간(settle time)이 지난 뒤 /api/stream/readings SSE 엔드포인트를 직접 구독해서 정해진 시간 동안 이벤트 수·이상치 수를 세어 처리량(events/sec)을 측정한다. 결과는 콘솔 요약 테이블과 CSV로 출력되며, 이 데이터가 그대로 6장의 시각화와 이 논문의 표·그림에 쓰였다.</w:t>
+      </w:r>
+    </w:p>
+    <w:p>
+      <w:pPr>
+        <w:spacing w:after="120"/>
+      </w:pPr>
+      <w:r>
+        <w:rPr>
+          <w:rFonts w:ascii="Calibri" w:hAnsi="Calibri" w:eastAsia="맑은 고딕"/>
+          <w:b w:val="0"/>
+          <w:i w:val="0"/>
+          <w:sz w:val="22"/>
+        </w:rPr>
+        <w:t>이 스크립트 자체에도 한 가지 버그가 있었다. 원래는 안정화 시간 동안 SSE 연결을 아예 열지 않다가 측정 시작 시점에 새로 연결하는 구조였는데, 그 사이 쌓인 backlog(5.3절 참고)가 측정 구간 앞부분에 섞여 들어가 처리량이 실제보다 부풀려지는 문제가 있었다. 연결을 안정화 단계부터 미리 열어두고 그 구간에는 읽어서 버리기만 하다가 측정 구간에서만 실제로 세는 방식으로 고쳐서, 6장의 수치가 이 오염 없이 순수한 처리량을 반영하도록 했다.</w:t>
       </w:r>
     </w:p>
     <w:p>
@@ -2095,7 +2109,35 @@
           <w:i w:val="0"/>
           <w:sz w:val="22"/>
         </w:rPr>
-        <w:t>이 구간을 버퍼링 없이 현재 값만 전달하는 방식(Sinks.many().multicast().directBestEffort())으로 바꿔서 해결했다. 생각해보면 대시보드는 과거 이력이 아니라 지금 상태만 보여주면 되는 화면이라, 애초에 버퍼링이 필요한 구간이 아니었다. 바꾼 뒤 다시 측정해보니, 새로 연결하면 과거 이벤트 없이 바로 최신 데이터부터 들어왔고 초당 이벤트 수치도 디바이스 수에 맞는 정상 범위로 안정됐다.</w:t>
+        <w:t>1차 수정. 이 구간을 버퍼링 없이 현재 값만 전달하는 방식(Sinks.many().multicast().directBestEffort())으로 바꿨다. 생각해보면 대시보드는 과거 이력이 아니라 지금 상태만 보여주면 되는 화면이라, 애초에 버퍼링이 필요한 구간이 아니라고 판단했다. 바꾼 뒤 다시 측정해보니, 새로 연결하면 과거 이벤트 없이 바로 최신 데이터부터 들어왔고 초당 이벤트 수치도 정상 범위로 안정되는 것처럼 보였다.</w:t>
+      </w:r>
+    </w:p>
+    <w:p>
+      <w:pPr>
+        <w:spacing w:after="120"/>
+      </w:pPr>
+      <w:r>
+        <w:rPr>
+          <w:rFonts w:ascii="Calibri" w:hAnsi="Calibri" w:eastAsia="맑은 고딕"/>
+          <w:b w:val="0"/>
+          <w:i w:val="0"/>
+          <w:sz w:val="22"/>
+        </w:rPr>
+        <w:t>재검증에서 발견한 추가 회귀. 그런데 이후 전체 안정성을 다시 점검하는 과정에서, 이번엔 대시보드가 계속 연결된 상태(활성 구독자)에서도 5,000대 규모로 올리면 이벤트의 상당수가 사라지는 현상이 새로 나타났다. 원인은 directBestEffort가 버퍼를 전혀 두지 않는다는 데 있었다. 매 tick마다 디바이스 수만큼의 이벤트가 자바 반복문 안에서 동기적으로 한꺼번에 발행되는데, 이 발행 속도는 마이크로초 단위로 끝나는 반면 SSE 연결의 수신 준비 상태(요청량)가 갱신되는 데는 아무리 빨라도 어느 정도의 실제 시간이 걸린다. directBestEffort는 그 순간 받을 준비가 안 된 구독자에게는 이벤트를 그냥 흘려보내므로, 버퍼가 전혀 없으면 이 찰나의 속도 차이만으로도 활성 구독자조차 상당수 이벤트를 놓치게 된다. curl로 직접 연결해 5초간 확인해보니 이 구간에서만 대략 절반 정도의 이벤트가 유실되고 있었다.</w:t>
+      </w:r>
+    </w:p>
+    <w:p>
+      <w:pPr>
+        <w:spacing w:after="120"/>
+      </w:pPr>
+      <w:r>
+        <w:rPr>
+          <w:rFonts w:ascii="Calibri" w:hAnsi="Calibri" w:eastAsia="맑은 고딕"/>
+          <w:b w:val="0"/>
+          <w:i w:val="0"/>
+          <w:sz w:val="22"/>
+        </w:rPr>
+        <w:t>최종 수정. 결국 버퍼를 완전히 없애는 것도, 6만 5천 개처럼 지나치게 큰 채로 두는 것도 정답이 아니었다. 결과 스트림을 Sinks.many().multicast().onBackpressureBuffer(20000, false)로 다시 조정했다(20,000은 디바이스 수 상한 maxDeviceCount와 같은 값이다). 이 정도 크기면 한 tick 안에서 몰리는 burst는 넉넉히 흡수하면서도, 구독자가 없는 동안 쌓이는 backlog의 최대치를 20,000개로 제한할 수 있다 — 과거의 무제한 누적(617,972건까지 관측)과는 질적으로 다르다. 다만 이 방식이 재연결 시 묵은 이벤트가 섞여 들어오는 현상을 완전히 없앤 것은 아니고, 그 규모를 크게 줄인 트레이드오프라는 점은 7.1절에서 다시 논의한다. 최종 수정 후 활성 구독자로 재확인한 결과, 5,000대 규모에서도 5초간 드롭 0건을 확인했다.</w:t>
       </w:r>
     </w:p>
     <w:p>
@@ -2314,7 +2356,7 @@
                 <w:i w:val="0"/>
                 <w:sz w:val="21"/>
               </w:rPr>
-              <w:t>100.1/sec</w:t>
+              <w:t>104.2/sec</w:t>
             </w:r>
           </w:p>
         </w:tc>
@@ -2334,7 +2376,7 @@
                 <w:i w:val="0"/>
                 <w:sz w:val="21"/>
               </w:rPr>
-              <w:t>74.6 ms</w:t>
+              <w:t>49.4 ms</w:t>
             </w:r>
           </w:p>
         </w:tc>
@@ -2376,7 +2418,7 @@
                 <w:i w:val="0"/>
                 <w:sz w:val="21"/>
               </w:rPr>
-              <w:t>974.9/sec</w:t>
+              <w:t>1,026.3/sec</w:t>
             </w:r>
           </w:p>
         </w:tc>
@@ -2396,7 +2438,7 @@
                 <w:i w:val="0"/>
                 <w:sz w:val="21"/>
               </w:rPr>
-              <w:t>7.3 ms</w:t>
+              <w:t>22.2 ms</w:t>
             </w:r>
           </w:p>
         </w:tc>
@@ -2438,7 +2480,7 @@
                 <w:i w:val="0"/>
                 <w:sz w:val="21"/>
               </w:rPr>
-              <w:t>4,975.7/sec</w:t>
+              <w:t>5,001.2/sec</w:t>
             </w:r>
           </w:p>
         </w:tc>
@@ -2458,7 +2500,7 @@
                 <w:i w:val="0"/>
                 <w:sz w:val="21"/>
               </w:rPr>
-              <w:t>6.5 ms</w:t>
+              <w:t>15.1 ms</w:t>
             </w:r>
           </w:p>
         </w:tc>
@@ -2477,10 +2519,24 @@
         <w:rPr>
           <w:rFonts w:ascii="Calibri" w:hAnsi="Calibri" w:eastAsia="맑은 고딕"/>
           <w:b w:val="0"/>
+          <w:i/>
+          <w:sz w:val="20"/>
+        </w:rPr>
+        <w:t>이 표의 수치는 이미 제출한 최종보고서(hwp)에 적힌 값(100.1 → 974.9 → 4,975.7 events/sec)과 다르다. 최종보고서 제출 이후 안정성을 한 번 더 점검하는 과정에서 5.3절에 서술한 추가 회귀(활성 구독자 이벤트 유실)를 발견해 수정했고, 그 재검증 과정에서 부하 테스트 스크립트 자체의 측정 오염 버그(4.5절)까지 함께 고쳐 더 정확해진 값이 이 표다. 최종보고서의 결론(디바이스 수 증가에 따라 처리량이 선형에 가깝게 확장된다)은 이 재측정 이후에도 그대로 유지된다.</w:t>
+      </w:r>
+    </w:p>
+    <w:p>
+      <w:pPr>
+        <w:spacing w:after="120"/>
+      </w:pPr>
+      <w:r>
+        <w:rPr>
+          <w:rFonts w:ascii="Calibri" w:hAnsi="Calibri" w:eastAsia="맑은 고딕"/>
+          <w:b w:val="0"/>
           <w:i w:val="0"/>
           <w:sz w:val="22"/>
         </w:rPr>
-        <w:t>디바이스 수를 10배(100→1,000대), 50배(100→5,000대) 늘렸는데도 처리량이 거의 선형으로 따라 올라갔다. 5,000대 규모에서도 대시보드 화면으로 시스템이 정상 동작함을 확인했고, 이때 이상치가 2,409건 누적된 것도 관측했다.</w:t>
+        <w:t>디바이스 수를 10배(100→1,000대), 50배(100→5,000대) 늘렸는데도 처리량이 거의 선형으로 따라 올라갔다. 5,000대 규모에서도 대시보드 화면으로 시스템이 정상 동작함을 확인했는데, 이때 초당 이벤트 수치는 디바이스 수와 정확히 일치하는 5,000건을 유지했고 이상치는 266건 누적된 것을 관측했다.</w:t>
       </w:r>
     </w:p>
     <w:p>
@@ -2644,7 +2700,7 @@
           <w:i w:val="0"/>
           <w:sz w:val="22"/>
         </w:rPr>
-        <w:t>디바이스 수를 100 → 1,000 → 5,000대로 50배까지 늘린 부하 테스트에서 처리량이 100.1 → 974.9 → 4,975.7 events/sec로 선형에 가깝게 늘어난 걸 실측으로 확인했다. 이 결과는 처음부터 그냥 나온 게 아니라, 부하 테스트 도중 발견한 이벤트 드롭 문제를 원인 분석 후 고친 결과다. 개선 전에는 디바이스 수를 아무리 늘려도 처리량이 300~400 events/sec에 머물러 있었는데, 이 병목을 직접 측정으로 찾아내고 해결했다는 점이 이 프로젝트에서 가장 의미 있었던 부분이다. 기능을 구현하는 데서 끝내지 않고, 그 시스템이 실제 부하에서 어떻게 움직이는지를 직접 만든 부하 테스트 스크립트로 검증하고 개선하는 사이클을 스스로 설계하고 돌려봤다는 데 의의가 있다.</w:t>
+        <w:t>디바이스 수를 100 → 1,000 → 5,000대로 50배까지 늘린 부하 테스트에서 처리량이 104.2 → 1,026.3 → 5,001.2 events/sec로 선형에 가깝게 늘어난 걸 실측으로 확인했다. 이 결과는 처음부터 그냥 나온 게 아니라, 부하 테스트 도중 발견한 이벤트 드롭 문제를 원인 분석 후 고친 결과다. 개선 전에는 디바이스 수를 아무리 늘려도 처리량이 300~400 events/sec에 머물러 있었는데, 이 병목을 직접 측정으로 찾아내고 해결했다는 점이 이 프로젝트에서 가장 의미 있었던 부분이다. 기능을 구현하는 데서 끝내지 않고, 그 시스템이 실제 부하에서 어떻게 움직이는지를 직접 만든 부하 테스트 스크립트로 검증하고 개선하는 사이클을 스스로 설계하고 돌려봤다는 데 의의가 있다.</w:t>
       </w:r>
     </w:p>
     <w:p>
@@ -2658,7 +2714,7 @@
           <w:i w:val="0"/>
           <w:sz w:val="22"/>
         </w:rPr>
-        <w:t>이상치 탐지 로직도 통계 공식을 그대로 갖다 쓰는 데서 끝내지 않았다. Z-score를 계산하는 시점을 신규 값을 반영하기 이전으로 잡아서, 극단값 하나가 자기 판정 기준을 즉시 넓혀버려 정작 그 값은 이상치로 안 잡히는 논리적 결함을 미리 막았다. 또 실시간 스트림을 처리하는 두 구간에 서로 다른 백프레셔 전략을 썼는데, 구독자가 항상 고정된 내부 구간에는 대용량 버퍼링을, 구독자가 수시로 바뀌는 대시보드 전달 구간에는 최신 값만 전달하는 방식을 적용했다. 안정성과 실시간성이라는, 한쪽을 세우면 다른 쪽이 흔들리는 두 요구를 구간의 성격에 맞게 따로 풀어낸 것이다.</w:t>
+        <w:t>이상치 탐지 로직도 통계 공식을 그대로 갖다 쓰는 데서 끝내지 않았다. Z-score를 계산하는 시점을 신규 값을 반영하기 이전으로 잡아서, 극단값 하나가 자기 판정 기준을 즉시 넓혀버려 정작 그 값은 이상치로 안 잡히는 논리적 결함을 미리 막았다. 또 실시간 스트림을 처리하는 두 구간에 서로 다른 크기의 백프레셔 전략을 썼는데, 구독자가 항상 고정된 내부 구간에는 대용량 버퍼링(65,536)을, 구독자가 수시로 바뀌는 대시보드 전달 구간에는 burst만 흡수할 정도로 작게 제한한 버퍼링(20,000)을 적용했다. 안정성과 실시간성이라는, 한쪽을 세우면 다른 쪽이 흔들리는 두 요구를 구간의 성격에 맞게 따로 풀어낸 것이다.</w:t>
       </w:r>
     </w:p>
     <w:p>
@@ -2707,7 +2763,21 @@
           <w:i w:val="0"/>
           <w:sz w:val="22"/>
         </w:rPr>
-        <w:t>5장의 네 가지 문제 중 두 가지는 결국 같은 원리로 설명된다. 버퍼는 생산자와 소비자의 속도 차이를 흡수해주지만, 그 전략은 스트림의 성격에 맞게 골라야 한다는 것이다. 구독자가 항상 고정돼 있고 순간적인 버스트를 흡수해야 하는 구간(시뮬레이터→탐지 엔진)에는 버퍼링이 맞았고, 구독자가 수시로 바뀌고 항상 최신 상태만 의미 있는 구간(탐지 엔진→대시보드)에는 버퍼 없는 최선형 전달이 더 맞았다. 버퍼를 무작정 키우는 게 만능 해법이 아니라, 스트림이 과거를 보존해야 하는지 아니면 지금 상태만 중요한지에 따라 전략을 나눠 써야 한다는 걸 이번에 직접 겪으면서 알게 됐다.</w:t>
+        <w:t>5장의 네 가지 문제 중 두 가지(5.1, 5.3)는 결국 같은 원리로 설명된다. 버퍼는 생산자와 소비자의 속도 차이를 흡수해주지만, 그 크기와 유무는 스트림의 성격에 맞게 골라야 한다는 것이다. 구독자가 항상 고정돼 있는 구간(시뮬레이터→탐지 엔진)은 순간적인 burst만 흡수하면 되므로 넉넉한 버퍼링으로 충분했다. 반면 구독자가 수시로 바뀌고 항상 최신 상태만 의미 있는 구간(탐지 엔진→대시보드)은 처음에 "버퍼를 아예 없애면 되지 않을까" 생각했지만, 이 판단은 절반만 맞았다.</w:t>
+      </w:r>
+    </w:p>
+    <w:p>
+      <w:pPr>
+        <w:spacing w:after="120"/>
+      </w:pPr>
+      <w:r>
+        <w:rPr>
+          <w:rFonts w:ascii="Calibri" w:hAnsi="Calibri" w:eastAsia="맑은 고딕"/>
+          <w:b w:val="0"/>
+          <w:i w:val="0"/>
+          <w:sz w:val="22"/>
+        </w:rPr>
+        <w:t>5.3절에서 겪었듯, 버퍼를 완전히 없앤 directBestEffort는 재연결 시 묵은 이벤트가 몰리는 문제는 해결했지만, 한 tick 안에서 동기적으로 몰리는 burst 자체를 흡수하지 못해 활성 구독자에게도 이벤트를 잃게 만들었다. 즉 "버퍼가 있으면 backlog가 쌓이고, 버퍼가 없으면 burst를 못 받아낸다"는 하나의 축 위의 두 극단이 각각 다른 방식으로 문제였던 셈이다. 결국 택한 것은 버퍼를 없애는 게 아니라 작게 제한하는 것이었다 — burst는 흡수하되, 오래 유휴 상태였다가 재연결했을 때 몰리는 backlog의 최대치도 함께 제한하는 절충안이다. 이 절충안도 재연결 시 backlog가 아예 없어지는 것은 아니라서, 극단적으로 짧은 유휴 시간에는 여전히 약간의 burst가 남는다. 버퍼 크기를 무작정 늘리거나 없애는 이분법이 아니라, 두 요구 사이에서 크기를 조정하며 감내할 수 있는 수준을 찾는 문제라는 걸 이번에 직접 겪으며 알게 됐다.</w:t>
       </w:r>
     </w:p>
     <w:p>
@@ -2793,7 +2863,7 @@
           <w:i w:val="0"/>
           <w:sz w:val="22"/>
         </w:rPr>
-        <w:t>Spring WebFlux 기반 반응형 아키텍처로 실시간 다중 디바이스 이상 탐지 모니터링 시스템 Welfry를 만들고, Welford's Online Algorithm과 Z-score를 결합한 경량 통계적 이상 탐지를 적용했다. 디바이스 수 증가에 따른 안정성을 실제로 검증하는 과정에서 이벤트 드롭, 이상치 오탐, 대시보드 수치 폭주, 테스트 프레임워크 호환성이라는 네 가지 문제를 직접 겪고 고쳤고, 그 결과 100대에서 5,000대까지 처리량이 100.1 → 974.9 → 4,975.7 events/sec로 선형에 가깝게 늘어남을 확인했다. warm-up 임계값으로 오탐률도 6.5~6.6%에서 1.2~1.3%로 줄였고, 21건의 테스트와 CI 파이프라인으로 검증 체계를 갖췄다. 처음 잡았던 목표 — 실시간 모니터링 시스템 구축, 통계 기반 이상 탐지, 디바이스 수 증가에 따른 안정성 검증 — 을 모두 이뤘다.</w:t>
+        <w:t>Spring WebFlux 기반 반응형 아키텍처로 실시간 다중 디바이스 이상 탐지 모니터링 시스템 Welfry를 만들고, Welford's Online Algorithm과 Z-score를 결합한 경량 통계적 이상 탐지를 적용했다. 디바이스 수 증가에 따른 안정성을 실제로 검증하는 과정에서 이벤트 드롭, 이상치 오탐, 대시보드 수치 폭주, 테스트 프레임워크 호환성이라는 네 가지 문제를 직접 겪고 고쳤다. 대시보드 수치 폭주 문제는 1차 수정(directBestEffort)이 활성 구독자의 이벤트 유실이라는 새 회귀를 낳는 것을 재검증 중에 발견해 다시 조정(onBackpressureBuffer(20000))하는 2단계를 거쳤다. 그 결과 100대에서 5,000대까지 처리량이 104.2 → 1,026.3 → 5,001.2 events/sec로 선형에 가깝게 늘어남을 확인했다. warm-up 임계값으로 오탐률도 6.5~6.6%에서 1.2~1.3%로 줄였고, 21건의 테스트와 CI 파이프라인으로 검증 체계를 갖췄다. 처음 잡았던 목표 — 실시간 모니터링 시스템 구축, 통계 기반 이상 탐지, 디바이스 수 증가에 따른 안정성 검증 — 을 모두 이뤘다.</w:t>
       </w:r>
     </w:p>
     <w:p>

</xml_diff>